<commit_message>
Add a design diagram to Decision Log 3 closing the LO3 visual-evidence gap
A clean pipeline-overview diagram (question set -> answer stage -> judging stage -> dashboard -> self-check -> final leaderboard) embedded directly in the Designing-phase decision log, giving the design reasoning a visual anchor a reader can follow at a glance.
</commit_message>
<xml_diff>
--- a/documents/Decision_Log_3.docx
+++ b/documents/Decision_Log_3.docx
@@ -2261,6 +2261,63 @@
         <w:spacing w:before="60" w:after="60"/>
         <w:ind w:left="360"/>
       </w:pPr>
+    </w:p>
+    <w:p/>
+    <w:p>
+      <w:r>
+        <w:rPr>
+          <w:b/>
+          <w:sz w:val="26"/>
+        </w:rPr>
+        <w:t>Design Diagram — Decision Log 3</w:t>
+      </w:r>
+    </w:p>
+    <w:p>
+      <w:r>
+        <w:rPr>
+          <w:i/>
+        </w:rPr>
+        <w:t>Figure DL3-1: A visual map of the benchmark pipeline as designed — from raw question to a final, audited leaderboard. Drawn up to make the design decisions in this log easier to follow at a glance, and to show how the later self-check stage (Decision Log 5) was always meant to close the loop on trust.</w:t>
+      </w:r>
+    </w:p>
+    <w:p>
+      <w:pPr>
+        <w:jc w:val="center"/>
+      </w:pPr>
+      <w:r>
+        <w:drawing>
+          <wp:inline xmlns:a="http://schemas.openxmlformats.org/drawingml/2006/main" xmlns:pic="http://schemas.openxmlformats.org/drawingml/2006/picture">
+            <wp:extent cx="5029200" cy="6163686"/>
+            <wp:docPr id="1978535828" name="Picture 1978535828"/>
+            <wp:cNvGraphicFramePr>
+              <a:graphicFrameLocks noChangeAspect="1"/>
+            </wp:cNvGraphicFramePr>
+            <a:graphic>
+              <a:graphicData uri="http://schemas.openxmlformats.org/drawingml/2006/picture">
+                <pic:pic>
+                  <pic:nvPicPr>
+                    <pic:cNvPr id="0" name="dl3_design_diagram.png"/>
+                    <pic:cNvPicPr/>
+                  </pic:nvPicPr>
+                  <pic:blipFill>
+                    <a:blip r:embed="rId16"/>
+                    <a:stretch>
+                      <a:fillRect/>
+                    </a:stretch>
+                  </pic:blipFill>
+                  <pic:spPr>
+                    <a:xfrm>
+                      <a:off x="0" y="0"/>
+                      <a:ext cx="5029200" cy="6163686"/>
+                    </a:xfrm>
+                    <a:prstGeom prst="rect"/>
+                  </pic:spPr>
+                </pic:pic>
+              </a:graphicData>
+            </a:graphic>
+          </wp:inline>
+        </w:drawing>
+      </w:r>
     </w:p>
     <w:sectPr>
       <w:pgSz w:w="12240" w:h="15840"/>

</xml_diff>

<commit_message>
Add standalone Design Document with README-matched pipeline diagram and dashboard view; revert DL3 to a clean decision summary
The pipeline diagram and dashboard screenshot now live in their own
Design Document (what the system is, file by file) rather than inside
Decision Log 3 (why the decisions were made). Decision Log 3 is restored
to its original decision-summary form. Closes the LO3 visual-evidence gap
without blurring the distinction between the two documents.
</commit_message>
<xml_diff>
--- a/documents/Decision_Log_3.docx
+++ b/documents/Decision_Log_3.docx
@@ -2261,63 +2261,6 @@
         <w:spacing w:before="60" w:after="60"/>
         <w:ind w:left="360"/>
       </w:pPr>
-    </w:p>
-    <w:p/>
-    <w:p>
-      <w:r>
-        <w:rPr>
-          <w:b/>
-          <w:sz w:val="26"/>
-        </w:rPr>
-        <w:t>Design Diagram — Decision Log 3</w:t>
-      </w:r>
-    </w:p>
-    <w:p>
-      <w:r>
-        <w:rPr>
-          <w:i/>
-        </w:rPr>
-        <w:t>Figure DL3-1: A visual map of the benchmark pipeline as designed — from raw question to a final, audited leaderboard. Drawn up to make the design decisions in this log easier to follow at a glance, and to show how the later self-check stage (Decision Log 5) was always meant to close the loop on trust.</w:t>
-      </w:r>
-    </w:p>
-    <w:p>
-      <w:pPr>
-        <w:jc w:val="center"/>
-      </w:pPr>
-      <w:r>
-        <w:drawing>
-          <wp:inline xmlns:a="http://schemas.openxmlformats.org/drawingml/2006/main" xmlns:pic="http://schemas.openxmlformats.org/drawingml/2006/picture">
-            <wp:extent cx="5029200" cy="6163686"/>
-            <wp:docPr id="1978535828" name="Picture 1978535828"/>
-            <wp:cNvGraphicFramePr>
-              <a:graphicFrameLocks noChangeAspect="1"/>
-            </wp:cNvGraphicFramePr>
-            <a:graphic>
-              <a:graphicData uri="http://schemas.openxmlformats.org/drawingml/2006/picture">
-                <pic:pic>
-                  <pic:nvPicPr>
-                    <pic:cNvPr id="0" name="dl3_design_diagram.png"/>
-                    <pic:cNvPicPr/>
-                  </pic:nvPicPr>
-                  <pic:blipFill>
-                    <a:blip r:embed="rId16"/>
-                    <a:stretch>
-                      <a:fillRect/>
-                    </a:stretch>
-                  </pic:blipFill>
-                  <pic:spPr>
-                    <a:xfrm>
-                      <a:off x="0" y="0"/>
-                      <a:ext cx="5029200" cy="6163686"/>
-                    </a:xfrm>
-                    <a:prstGeom prst="rect"/>
-                  </pic:spPr>
-                </pic:pic>
-              </a:graphicData>
-            </a:graphic>
-          </wp:inline>
-        </w:drawing>
-      </w:r>
     </w:p>
     <w:sectPr>
       <w:pgSz w:w="12240" w:h="15840"/>

</xml_diff>